<commit_message>
Adding code for saving relative age-distribution
</commit_message>
<xml_diff>
--- a/Report/Perch_figures/Askrikefjärden (Vaxholm)_bayesian_p_prop_zero.docx
+++ b/Report/Perch_figures/Askrikefjärden (Vaxholm)_bayesian_p_prop_zero.docx
@@ -352,7 +352,7 @@
                 <w:szCs w:val="22"/>
                 <w:color w:val="000000"/>
               </w:rPr>
-              <w:t xml:space="preserve">0.00</w:t>
+              <w:t xml:space="preserve">0.09</w:t>
             </w:r>
           </w:p>
         </w:tc>
@@ -464,7 +464,7 @@
                 <w:szCs w:val="22"/>
                 <w:color w:val="000000"/>
               </w:rPr>
-              <w:t xml:space="preserve">0.17</w:t>
+              <w:t xml:space="preserve">0.21</w:t>
             </w:r>
           </w:p>
         </w:tc>
@@ -576,14 +576,14 @@
                 <w:szCs w:val="22"/>
                 <w:color w:val="000000"/>
               </w:rPr>
-              <w:t xml:space="preserve">0.66</w:t>
+              <w:t xml:space="preserve">0.11</w:t>
             </w:r>
           </w:p>
         </w:tc>
       </w:tr>
       <w:tr>
         <w:trPr>
-          <w:trHeight w:val="571" w:hRule="auto"/>
+          <w:trHeight w:val="572" w:hRule="auto"/>
         </w:trPr>
         body5
         <w:tc>
@@ -688,14 +688,14 @@
                 <w:szCs w:val="22"/>
                 <w:color w:val="000000"/>
               </w:rPr>
-              <w:t xml:space="preserve">0.56</w:t>
+              <w:t xml:space="preserve">0.31</w:t>
             </w:r>
           </w:p>
         </w:tc>
       </w:tr>
       <w:tr>
         <w:trPr>
-          <w:trHeight w:val="571" w:hRule="auto"/>
+          <w:trHeight w:val="572" w:hRule="auto"/>
         </w:trPr>
         body6
         <w:tc>
@@ -800,7 +800,7 @@
                 <w:szCs w:val="22"/>
                 <w:color w:val="000000"/>
               </w:rPr>
-              <w:t xml:space="preserve">0.19</w:t>
+              <w:t xml:space="preserve">0.38</w:t>
             </w:r>
           </w:p>
         </w:tc>
@@ -912,7 +912,7 @@
                 <w:szCs w:val="22"/>
                 <w:color w:val="000000"/>
               </w:rPr>
-              <w:t xml:space="preserve">0.69</w:t>
+              <w:t xml:space="preserve">0.65</w:t>
             </w:r>
           </w:p>
         </w:tc>
@@ -1024,7 +1024,7 @@
                 <w:szCs w:val="22"/>
                 <w:color w:val="000000"/>
               </w:rPr>
-              <w:t xml:space="preserve">0.50</w:t>
+              <w:t xml:space="preserve">0.65</w:t>
             </w:r>
           </w:p>
         </w:tc>

</xml_diff>

<commit_message>
Adding test-fishing area Östra Gotlands m kustvatten
</commit_message>
<xml_diff>
--- a/Report/Perch_figures/Askrikefjärden (Vaxholm)_bayesian_p_prop_zero.docx
+++ b/Report/Perch_figures/Askrikefjärden (Vaxholm)_bayesian_p_prop_zero.docx
@@ -352,7 +352,7 @@
                 <w:szCs w:val="22"/>
                 <w:color w:val="000000"/>
               </w:rPr>
-              <w:t xml:space="preserve">0.09</w:t>
+              <w:t xml:space="preserve">0.19</w:t>
             </w:r>
           </w:p>
         </w:tc>
@@ -464,7 +464,7 @@
                 <w:szCs w:val="22"/>
                 <w:color w:val="000000"/>
               </w:rPr>
-              <w:t xml:space="preserve">0.21</w:t>
+              <w:t xml:space="preserve">0.30</w:t>
             </w:r>
           </w:p>
         </w:tc>
@@ -576,7 +576,7 @@
                 <w:szCs w:val="22"/>
                 <w:color w:val="000000"/>
               </w:rPr>
-              <w:t xml:space="preserve">0.11</w:t>
+              <w:t xml:space="preserve">0.08</w:t>
             </w:r>
           </w:p>
         </w:tc>
@@ -688,14 +688,14 @@
                 <w:szCs w:val="22"/>
                 <w:color w:val="000000"/>
               </w:rPr>
-              <w:t xml:space="preserve">0.31</w:t>
+              <w:t xml:space="preserve">0.53</w:t>
             </w:r>
           </w:p>
         </w:tc>
       </w:tr>
       <w:tr>
         <w:trPr>
-          <w:trHeight w:val="572" w:hRule="auto"/>
+          <w:trHeight w:val="571" w:hRule="auto"/>
         </w:trPr>
         body6
         <w:tc>
@@ -800,7 +800,7 @@
                 <w:szCs w:val="22"/>
                 <w:color w:val="000000"/>
               </w:rPr>
-              <w:t xml:space="preserve">0.38</w:t>
+              <w:t xml:space="preserve">0.18</w:t>
             </w:r>
           </w:p>
         </w:tc>
@@ -1024,7 +1024,7 @@
                 <w:szCs w:val="22"/>
                 <w:color w:val="000000"/>
               </w:rPr>
-              <w:t xml:space="preserve">0.65</w:t>
+              <w:t xml:space="preserve">0.83</w:t>
             </w:r>
           </w:p>
         </w:tc>

</xml_diff>